<commit_message>
Diseño de clases al día con el Clérigo del Orden
Estado del Clérigo (Vida y Orden implementadas, Luz pendiente), el combo del
ataque básico, los números del Orden (aturdido al primer impacto, Aturdir,
Heroísmo nuevo y Zona de verdad), Desarmar resuelto, la entrega de 6 s y el
libro quitado de la mano izquierda.

Co-Authored-By: Claude Opus 5.5 <noreply@anthropic.com>
</commit_message>
<xml_diff>
--- a/DesignDocuments/Mercenaries_Diseno_de_Clases.docx
+++ b/DesignDocuments/Mercenaries_Diseno_de_Clases.docx
@@ -1785,7 +1785,7 @@
           <w:b/>
           <w:bCs/>
         </w:rPr>
-        <w:t xml:space="preserve">Al minuto 1 aparece el Objetivo (hoy una caja dorada; será la Bolsa de oro) en la meseta del centro. Se levanta con solo acercarse. Cada equipo debe llevarlo a la plataforma de entrega de su base: entregarlo (quedándose 3 segundos en la plataforma: si recibe daño o sale de la zona, la cuenta vuelve a empezar) da 1 punto de victoria y el siguiente aparece 30 segundos después. Con 2 puntos se gana; si se acaban los 15 minutos, gana el que va adelante. Que los </w:t>
+        <w:t xml:space="preserve">Al minuto 1 aparece el Objetivo (hoy una caja dorada; será la Bolsa de oro) en la meseta del centro. Se levanta con solo acercarse. Cada equipo debe llevarlo a la plataforma de entrega de su base: entregarlo (quedándose 6 segundos en la plataforma: si recibe daño o sale de la zona, la cuenta vuelve a empezar) da 1 punto de victoria y el siguiente aparece 30 segundos después. Con 2 puntos se gana; si se acaban los 15 minutos, gana el que va adelante. Que los </w:t>
       </w:r>
       <w:proofErr w:type="spellStart"/>
       <w:r>
@@ -10733,7 +10733,7 @@
                 <w:sz w:val="20"/>
                 <w:szCs w:val="20"/>
               </w:rPr>
-              <w:t>Bastón en la mano derecha y libro de oraciones en la izquierda</w:t>
+              <w:t>Bastón (el libro de oraciones en la mano izquierda se quitó por ahora: la pose se veía rara)</w:t>
             </w:r>
           </w:p>
         </w:tc>
@@ -10829,7 +10829,7 @@
                 <w:sz w:val="20"/>
                 <w:szCs w:val="20"/>
               </w:rPr>
-              <w:t>Kit base y Dominio de la vida implementados y probados (30 de septiembre de 2026); Luz y Orden pendientes</w:t>
+              <w:t>Kit base, Dominio de la vida y Dominio del orden implementados (30 de septiembre de 2026); Luz pendiente</w:t>
             </w:r>
           </w:p>
         </w:tc>
@@ -11022,7 +11022,7 @@
                 <w:sz w:val="20"/>
                 <w:szCs w:val="20"/>
               </w:rPr>
-              <w:t>Arco de luz diagonal a alcance medio que daña a los enemigos y sana a los aliados en su camino.</w:t>
+              <w:t>Combo: un golpe de bastón en cono (daño físico) y después un arco de luz diagonal a alcance medio (daño mágico) que daña a los enemigos y sana a los aliados en su camino.</w:t>
             </w:r>
           </w:p>
         </w:tc>
@@ -11691,7 +11691,7 @@
           <w:i/>
           <w:iCs/>
         </w:rPr>
-        <w:t>Los hechizos se tornan azules y el bastón se cambia por un martillo de una mano. Sus ataques aturden brevemente al primer enemigo impactado.</w:t>
+        <w:t>Los hechizos se tornan azules y el bastón se cambia por un martillo de una mano. Sus ataques aturden 1 segundo al primer enemigo que toca el arco de luz (el mismo enemigo, como mucho una vez cada 3 segundos, para que no quede aturdido para siempre).</w:t>
       </w:r>
     </w:p>
     <w:tbl>
@@ -11815,7 +11815,7 @@
                 <w:sz w:val="20"/>
                 <w:szCs w:val="20"/>
               </w:rPr>
-              <w:t>Selecciona a un enemigo a alcance medio: por un corto periodo, si impacta un ataque contra un aliado, queda aturdido un tiempo.</w:t>
+              <w:t>Selecciona a un enemigo a alcance medio y lo marca por 4 segundos: si en ese tiempo le pega a un aliado (o al Clérigo), queda aturdido y la marca se consume.</w:t>
             </w:r>
           </w:p>
         </w:tc>
@@ -11863,7 +11863,7 @@
                 <w:sz w:val="20"/>
                 <w:szCs w:val="20"/>
               </w:rPr>
-              <w:t>Aura a distancia media que hace a todos los aliados al alcance más resistentes a los aturdimientos.</w:t>
+              <w:t>Reemplaza a la Bendición: los aliados a los que cura reciben su resistencia al daño y, además, un 30 % de resistencia al control por 6 segundos. (Antes era un aura de alcance medio; se cambió el 30 de septiembre de 2026.)</w:t>
             </w:r>
           </w:p>
         </w:tc>
@@ -11911,7 +11911,7 @@
                 <w:sz w:val="20"/>
                 <w:szCs w:val="20"/>
               </w:rPr>
-              <w:t>Selecciona una zona amplia donde, por un corto periodo, nadie puede atacar: dentro de ella todos los jugadores quedan silenciados y desarmados, de los tres equipos por igual. Los aliados en contacto con la zona se curan.</w:t>
+              <w:t>Selecciona una zona de 6 m de radio a alcance medio donde, durante 5 segundos, nadie puede atacar: dentro de ella todos los jugadores quedan silenciados y desarmados, de los tres equipos por igual. Los aliados en contacto con la zona se curan.</w:t>
             </w:r>
           </w:p>
         </w:tc>
@@ -13964,7 +13964,7 @@
                 <w:sz w:val="20"/>
                 <w:szCs w:val="20"/>
               </w:rPr>
-              <w:t>Vida implementada · Luz y Orden pendientes</w:t>
+              <w:t>Vida y Orden implementadas · Luz pendiente</w:t>
             </w:r>
           </w:p>
         </w:tc>
@@ -14325,7 +14325,7 @@
                 <w:sz w:val="20"/>
                 <w:szCs w:val="20"/>
               </w:rPr>
-              <w:t>Definido como concepto (no puede usar ataques básicos, sí habilidades) pero sin implementar. Lo necesitan Maestro de batalla y Zona de verdad.</w:t>
+              <w:t>Implementado (30 de septiembre de 2026): el tag State_Disarmed bloquea el ataque básico de cualquier clase y deja las habilidades. Lo usa la Zona de verdad; lo va a reusar el Maestro de batalla del Guerrero.</w:t>
             </w:r>
           </w:p>
         </w:tc>

</xml_diff>

<commit_message>
Monje: patadas que se corren de costado y apuntan arriba; Maestro de batalla con su elección por postura
- GA_RushAttack: el giro (TurnRate) pasa a StrafeSpeed (izquierda/derecha corren
  de costado sin girar la embestida) y AimVertical + MaxPitch (sale con el ángulo
  de la mira, como el dash, para alcanzar a quien está en el aire). La red y el
  movimiento del dueño llevan la velocidad vertical. Prendido en las dos patadas.
- Ajustes de Gustavo al Monje: velocidad de ataque, patadas a 20 m y 20 m/s,
  importación de los clips de puños y patadas.
- Class_BattleMasterFighter: el clic izquierdo vuelve a GA_BattleMasterPrimary
  (había quedado en GA_GreatswordSlash y siempre hacía el tajo a dos manos).
- PENDIENTES y diseño de clases al día.

Co-Authored-By: Claude Opus 5.5 <noreply@anthropic.com>
</commit_message>
<xml_diff>
--- a/DesignDocuments/Mercenaries_Diseno_de_Clases.docx
+++ b/DesignDocuments/Mercenaries_Diseno_de_Clases.docx
@@ -7163,6 +7163,15 @@
                 <w:szCs w:val="20"/>
               </w:rPr>
               <w:t>Vuela hacia adelante una gran distancia, dañando al primer enemigo impactado. Con Ki (Patada del dragón): más velocidad de vuelo y aturde al primer impactado.</w:t>
+            </w:r>
+          </w:p>
+          <w:p>
+            <w:r>
+              <w:rPr>
+                <w:sz w:val="20"/>
+                <w:szCs w:val="20"/>
+              </w:rPr>
+              <w:t xml:space="preserve">Mientras vuela, izquierda y derecha la corren de costado sin girarla, y sale con el ángulo vertical de la mira, como el dash: apuntando arriba alcanza a los enemigos en el aire. Volver a apretar el botón la corta.</w:t>
             </w:r>
           </w:p>
         </w:tc>

</xml_diff>

<commit_message>
Bots: las clases nuevas, el hacha apuntada, los invisibles y las embestidas
- Un mantenido no se reaprieta mientras hay otro abierto (el hacha apuntada
  para siempre); cuánto se sostiene depende de qué es (HoldSecondsFor).
- Las habilidades sobre un aliado se apuntan al aliado (ChooseAllyFor); la
  Proyección arcana se pone una vez.
- La Sobrecarga de hechizos: un bot la usa sin volar (GA_Flight.GroundForBot,
  GameplayEffect.CreateCopyWithoutTags).
- Dashes derechos; definitivas de buff a distancia y de área de un asesino.
- No ven a un invisible salvo que esté revelado a su equipo (CanPerceive).
- Embestidas y cadenas en bots: la Patada voladora, el Corte final y Muerte
  silenciosa (ServerStartRush / ServerStopRush -> BotController.ServerDash).
- El Destello del Clérigo es movimiento: escapar o llegar al aliado herido.
- Abjuración con rol Daño. Pendientes y documentos al día; probado.

Co-Authored-By: Claude Opus 5.5 <noreply@anthropic.com>
</commit_message>
<xml_diff>
--- a/DesignDocuments/Mercenaries_Diseno_de_Clases.docx
+++ b/DesignDocuments/Mercenaries_Diseno_de_Clases.docx
@@ -2117,7 +2117,7 @@
                 <w:sz w:val="20"/>
                 <w:szCs w:val="20"/>
               </w:rPr>
-              <w:t xml:space="preserve">Desde la sala de espera el host puede llenar lugares con bots: juegan con la misma clase y habilidades que un jugador, con un rol según su clase (el Tanque se le tira encima, el Daño espera a que el otro esté débil, el Soporte sostiene a los suyos, y el Daño que pega de lejos —el Mago, el Explorador— pelea a distancia; el Filo danzante, que corta, pelea de cerca). Quien se quede de espectador ve la partida con una cámara libre y puede seguir a cualquier jugador.</w:t>
+              <w:t xml:space="preserve">Desde la sala de espera el host puede llenar lugares con bots: juegan con la misma clase y habilidades que un jugador, con un rol según su clase (el Tanque se le tira encima, el Daño espera a que el otro esté débil, el Soporte sostiene a los suyos, y el Daño que pega de lejos —el Mago, el Explorador— pelea a distancia; el Filo danzante, que corta, pelea de cerca. Un bot que apunta (un lanzamiento, un arco cargado) suelta a su tiempo, y la Abjuración proyecta una vez sobre el aliado más cercano. Un bot no ve a un invisible (salvo que lo revelen a su equipo), y usa también las patadas del Monje, el Corte final del Samurái, la Muerte silenciosa del Shinobi y el Destello del Clérigo (para escapar o socorrer)). Quien se quede de espectador ve la partida con una cámara libre y puede seguir a cualquier jugador.</w:t>
             </w:r>
           </w:p>
         </w:tc>
@@ -9261,7 +9261,7 @@
         <w:spacing w:after="120" w:line="276" w:lineRule="auto"/>
       </w:pPr>
       <w:r>
-        <w:t xml:space="preserve">Protege a un aliado y pelea desde él. Mismas estadísticas que la Evocación. Para la definitiva cuenta como Soporte: el escudo que les da a sus aliados cuenta como curarlos. El escudo (de cualquier fuente del juego) se ve en la barra de arriba de la cabeza como un tramo celeste después de la vida, que sale por la derecha si pasa de la vida máxima; quien tiene escudo de la Abjuración lleva además una burbuja. Pendiente del arte: el libro brilla con un círculo casi divino del color del hechizo seleccionado.</w:t>
+        <w:t xml:space="preserve">Protege a un aliado y pelea desde él. Mismas estadísticas que la Evocación. Es Daño, como el Mago: el rol lo fija la clase (hasta el 23 de octubre de 2026 era Soporte). El escudo (de cualquier fuente del juego) se ve en la barra de arriba de la cabeza como un tramo celeste después de la vida, que sale por la derecha si pasa de la vida máxima; quien tiene escudo de la Abjuración lleva además una burbuja. Pendiente del arte: el libro brilla con un círculo casi divino del color del hechizo seleccionado.</w:t>
       </w:r>
     </w:p>
     <w:tbl>

</xml_diff>